<commit_message>
docs: fix the figures in the report and add the live system links
Figure 5 was showing the architecture diagram instead of the origin-destination
flow heatmap: the two images happened to share pixel dimensions, and an earlier
in-place image swap matched on that, so the diagram landed in the wrong slot and
appeared twice. Regenerated from results.json, so every figure is back in its own
place and the architecture appears once, in its draw.io form.

Adds the hosted system and the repository to the title page and a new section on
the live deployment.
</commit_message>
<xml_diff>
--- a/reports/Atreides_Technical_Report.docx
+++ b/reports/Atreides_Technical_Report.docx
@@ -62,7 +62,7 @@
     </w:p>
     <w:p>
       <w:pPr>
-        <w:spacing w:after="1600"/>
+        <w:spacing w:after="240"/>
         <w:jc w:val="center"/>
       </w:pPr>
       <w:r>
@@ -73,6 +73,50 @@
         </w:rPr>
         <w:t xml:space="preserve">48,601,782 taxi trips · April 2025 – March 2026</w:t>
       </w:r>
+    </w:p>
+    <w:p>
+      <w:pPr>
+        <w:spacing w:after="60"/>
+        <w:jc w:val="center"/>
+      </w:pPr>
+      <w:r>
+        <w:rPr>
+          <w:color w:val="595959"/>
+          <w:sz w:val="21"/>
+          <w:szCs w:val="21"/>
+        </w:rPr>
+        <w:t xml:space="preserve">Live system: </w:t>
+      </w:r>
+      <w:hyperlink w:history="1" r:id="rIdvhvuxrw7h7mxmtcavmb3k">
+        <w:r>
+          <w:rPr>
+            <w:rStyle w:val="Hyperlink"/>
+          </w:rPr>
+          <w:t xml:space="preserve">atreides-datathon.duckdns.org</w:t>
+        </w:r>
+      </w:hyperlink>
+    </w:p>
+    <w:p>
+      <w:pPr>
+        <w:spacing w:after="1300"/>
+        <w:jc w:val="center"/>
+      </w:pPr>
+      <w:r>
+        <w:rPr>
+          <w:color w:val="595959"/>
+          <w:sz w:val="21"/>
+          <w:szCs w:val="21"/>
+        </w:rPr>
+        <w:t xml:space="preserve">Source code: </w:t>
+      </w:r>
+      <w:hyperlink w:history="1" r:id="rIdblhbravjvn-wjfhapzylp">
+        <w:r>
+          <w:rPr>
+            <w:rStyle w:val="Hyperlink"/>
+          </w:rPr>
+          <w:t xml:space="preserve">github.com/CJChANu/Atreides_CodefestDatathon2026</w:t>
+        </w:r>
+      </w:hyperlink>
     </w:p>
     <w:tbl>
       <w:tblPr>
@@ -11670,7 +11714,7 @@
       <w:r>
         <w:drawing>
           <wp:inline distT="0" distB="0" distL="0" distR="0">
-            <wp:extent cx="6096000" cy="2838450"/>
+            <wp:extent cx="6096000" cy="2371725"/>
             <wp:effectExtent t="0" r="0" b="0" l="0"/>
             <wp:docPr id="1" name="" descr="" title=""/>
             <wp:cNvGraphicFramePr>
@@ -11695,7 +11739,7 @@
                   <pic:spPr bwMode="auto">
                     <a:xfrm>
                       <a:off x="0" y="0"/>
-                      <a:ext cx="6096000" cy="2838450"/>
+                      <a:ext cx="6096000" cy="2371725"/>
                     </a:xfrm>
                     <a:prstGeom prst="rect">
                       <a:avLst/>
@@ -12174,6 +12218,326 @@
           <w:szCs w:val="18"/>
         </w:rPr>
         <w:t xml:space="preserve">Figure 9 — Assistant web chat with suggested questions; each answer shows its SQL and result table.</w:t>
+      </w:r>
+    </w:p>
+    <w:p>
+      <w:pPr>
+        <w:pStyle w:val="Heading2"/>
+      </w:pPr>
+      <w:r>
+        <w:t xml:space="preserve">8.3 Live deployment</w:t>
+      </w:r>
+    </w:p>
+    <w:p>
+      <w:pPr>
+        <w:spacing w:after="100" w:line="264"/>
+      </w:pPr>
+      <w:r>
+        <w:t xml:space="preserve">Both bonus tracks run as a hosted service, not just as local files. A small Ubuntu 24.04 VPS serves the dashboard as a static page through nginx, while the assistant runs as a hardened systemd service (unprivileged user, read-only view of its own directory) bound to localhost behind the proxy. Every visitor gets an isolated conversation; the API is rate-limited per session and per IP.</w:t>
+      </w:r>
+    </w:p>
+    <w:tbl>
+      <w:tblPr>
+        <w:tblW w:type="dxa" w:w="9638"/>
+        <w:tblBorders>
+          <w:top w:val="single" w:color="auto" w:sz="4"/>
+          <w:left w:val="single" w:color="auto" w:sz="4"/>
+          <w:bottom w:val="single" w:color="auto" w:sz="4"/>
+          <w:right w:val="single" w:color="auto" w:sz="4"/>
+          <w:insideH w:val="single" w:color="auto" w:sz="4"/>
+          <w:insideV w:val="single" w:color="auto" w:sz="4"/>
+        </w:tblBorders>
+      </w:tblPr>
+      <w:tblGrid>
+        <w:gridCol w:w="3400"/>
+        <w:gridCol w:w="6238"/>
+      </w:tblGrid>
+      <w:tr>
+        <w:trPr>
+          <w:tblHeader/>
+        </w:trPr>
+        <w:tc>
+          <w:tcPr>
+            <w:tcW w:type="dxa" w:w="3400"/>
+            <w:tcBorders>
+              <w:top w:val="single" w:color="BFBFBF" w:sz="4"/>
+              <w:left w:val="single" w:color="BFBFBF" w:sz="4"/>
+              <w:bottom w:val="single" w:color="BFBFBF" w:sz="4"/>
+              <w:right w:val="single" w:color="BFBFBF" w:sz="4"/>
+            </w:tcBorders>
+            <w:shd w:fill="1F3864" w:val="clear"/>
+            <w:tcMar>
+              <w:top w:type="dxa" w:w="50"/>
+              <w:left w:type="dxa" w:w="90"/>
+              <w:bottom w:type="dxa" w:w="50"/>
+              <w:right w:type="dxa" w:w="90"/>
+            </w:tcMar>
+          </w:tcPr>
+          <w:p>
+            <w:r>
+              <w:rPr>
+                <w:b/>
+                <w:bCs/>
+                <w:color w:val="FFFFFF"/>
+                <w:sz w:val="17"/>
+                <w:szCs w:val="17"/>
+              </w:rPr>
+              <w:t xml:space="preserve">What</w:t>
+            </w:r>
+          </w:p>
+        </w:tc>
+        <w:tc>
+          <w:tcPr>
+            <w:tcW w:type="dxa" w:w="6238"/>
+            <w:tcBorders>
+              <w:top w:val="single" w:color="BFBFBF" w:sz="4"/>
+              <w:left w:val="single" w:color="BFBFBF" w:sz="4"/>
+              <w:bottom w:val="single" w:color="BFBFBF" w:sz="4"/>
+              <w:right w:val="single" w:color="BFBFBF" w:sz="4"/>
+            </w:tcBorders>
+            <w:shd w:fill="1F3864" w:val="clear"/>
+            <w:tcMar>
+              <w:top w:type="dxa" w:w="50"/>
+              <w:left w:type="dxa" w:w="90"/>
+              <w:bottom w:type="dxa" w:w="50"/>
+              <w:right w:type="dxa" w:w="90"/>
+            </w:tcMar>
+          </w:tcPr>
+          <w:p>
+            <w:r>
+              <w:rPr>
+                <w:b/>
+                <w:bCs/>
+                <w:color w:val="FFFFFF"/>
+                <w:sz w:val="17"/>
+                <w:szCs w:val="17"/>
+              </w:rPr>
+              <w:t xml:space="preserve">Address</w:t>
+            </w:r>
+          </w:p>
+        </w:tc>
+      </w:tr>
+      <w:tr>
+        <w:tc>
+          <w:tcPr>
+            <w:tcW w:type="dxa" w:w="3400"/>
+            <w:tcBorders>
+              <w:top w:val="single" w:color="BFBFBF" w:sz="4"/>
+              <w:left w:val="single" w:color="BFBFBF" w:sz="4"/>
+              <w:bottom w:val="single" w:color="BFBFBF" w:sz="4"/>
+              <w:right w:val="single" w:color="BFBFBF" w:sz="4"/>
+            </w:tcBorders>
+            <w:tcMar>
+              <w:top w:type="dxa" w:w="50"/>
+              <w:left w:type="dxa" w:w="90"/>
+              <w:bottom w:type="dxa" w:w="50"/>
+              <w:right w:type="dxa" w:w="90"/>
+            </w:tcMar>
+          </w:tcPr>
+          <w:p>
+            <w:r>
+              <w:rPr>
+                <w:b w:val="false"/>
+                <w:bCs w:val="false"/>
+                <w:color w:val="000000"/>
+                <w:sz w:val="17"/>
+                <w:szCs w:val="17"/>
+              </w:rPr>
+              <w:t xml:space="preserve">Business dashboard (Track 6)</w:t>
+            </w:r>
+          </w:p>
+        </w:tc>
+        <w:tc>
+          <w:tcPr>
+            <w:tcW w:type="dxa" w:w="6238"/>
+            <w:tcBorders>
+              <w:top w:val="single" w:color="BFBFBF" w:sz="4"/>
+              <w:left w:val="single" w:color="BFBFBF" w:sz="4"/>
+              <w:bottom w:val="single" w:color="BFBFBF" w:sz="4"/>
+              <w:right w:val="single" w:color="BFBFBF" w:sz="4"/>
+            </w:tcBorders>
+            <w:tcMar>
+              <w:top w:type="dxa" w:w="50"/>
+              <w:left w:type="dxa" w:w="90"/>
+              <w:bottom w:type="dxa" w:w="50"/>
+              <w:right w:type="dxa" w:w="90"/>
+            </w:tcMar>
+          </w:tcPr>
+          <w:p>
+            <w:r>
+              <w:rPr>
+                <w:b w:val="false"/>
+                <w:bCs w:val="false"/>
+                <w:color w:val="000000"/>
+                <w:sz w:val="17"/>
+                <w:szCs w:val="17"/>
+              </w:rPr>
+              <w:t xml:space="preserve">atreides-datathon.duckdns.org</w:t>
+            </w:r>
+          </w:p>
+        </w:tc>
+      </w:tr>
+      <w:tr>
+        <w:tc>
+          <w:tcPr>
+            <w:tcW w:type="dxa" w:w="3400"/>
+            <w:tcBorders>
+              <w:top w:val="single" w:color="BFBFBF" w:sz="4"/>
+              <w:left w:val="single" w:color="BFBFBF" w:sz="4"/>
+              <w:bottom w:val="single" w:color="BFBFBF" w:sz="4"/>
+              <w:right w:val="single" w:color="BFBFBF" w:sz="4"/>
+            </w:tcBorders>
+            <w:tcMar>
+              <w:top w:type="dxa" w:w="50"/>
+              <w:left w:type="dxa" w:w="90"/>
+              <w:bottom w:type="dxa" w:w="50"/>
+              <w:right w:type="dxa" w:w="90"/>
+            </w:tcMar>
+          </w:tcPr>
+          <w:p>
+            <w:r>
+              <w:rPr>
+                <w:b w:val="false"/>
+                <w:bCs w:val="false"/>
+                <w:color w:val="000000"/>
+                <w:sz w:val="17"/>
+                <w:szCs w:val="17"/>
+              </w:rPr>
+              <w:t xml:space="preserve">Mobility assistant (Track 5)</w:t>
+            </w:r>
+          </w:p>
+        </w:tc>
+        <w:tc>
+          <w:tcPr>
+            <w:tcW w:type="dxa" w:w="6238"/>
+            <w:tcBorders>
+              <w:top w:val="single" w:color="BFBFBF" w:sz="4"/>
+              <w:left w:val="single" w:color="BFBFBF" w:sz="4"/>
+              <w:bottom w:val="single" w:color="BFBFBF" w:sz="4"/>
+              <w:right w:val="single" w:color="BFBFBF" w:sz="4"/>
+            </w:tcBorders>
+            <w:tcMar>
+              <w:top w:type="dxa" w:w="50"/>
+              <w:left w:type="dxa" w:w="90"/>
+              <w:bottom w:type="dxa" w:w="50"/>
+              <w:right w:type="dxa" w:w="90"/>
+            </w:tcMar>
+          </w:tcPr>
+          <w:p>
+            <w:r>
+              <w:rPr>
+                <w:b w:val="false"/>
+                <w:bCs w:val="false"/>
+                <w:color w:val="000000"/>
+                <w:sz w:val="17"/>
+                <w:szCs w:val="17"/>
+              </w:rPr>
+              <w:t xml:space="preserve">atreides-datathon.duckdns.org/assistant</w:t>
+            </w:r>
+          </w:p>
+        </w:tc>
+      </w:tr>
+      <w:tr>
+        <w:tc>
+          <w:tcPr>
+            <w:tcW w:type="dxa" w:w="3400"/>
+            <w:tcBorders>
+              <w:top w:val="single" w:color="BFBFBF" w:sz="4"/>
+              <w:left w:val="single" w:color="BFBFBF" w:sz="4"/>
+              <w:bottom w:val="single" w:color="BFBFBF" w:sz="4"/>
+              <w:right w:val="single" w:color="BFBFBF" w:sz="4"/>
+            </w:tcBorders>
+            <w:tcMar>
+              <w:top w:type="dxa" w:w="50"/>
+              <w:left w:type="dxa" w:w="90"/>
+              <w:bottom w:type="dxa" w:w="50"/>
+              <w:right w:type="dxa" w:w="90"/>
+            </w:tcMar>
+          </w:tcPr>
+          <w:p>
+            <w:r>
+              <w:rPr>
+                <w:b w:val="false"/>
+                <w:bCs w:val="false"/>
+                <w:color w:val="000000"/>
+                <w:sz w:val="17"/>
+                <w:szCs w:val="17"/>
+              </w:rPr>
+              <w:t xml:space="preserve">Source code and full history</w:t>
+            </w:r>
+          </w:p>
+        </w:tc>
+        <w:tc>
+          <w:tcPr>
+            <w:tcW w:type="dxa" w:w="6238"/>
+            <w:tcBorders>
+              <w:top w:val="single" w:color="BFBFBF" w:sz="4"/>
+              <w:left w:val="single" w:color="BFBFBF" w:sz="4"/>
+              <w:bottom w:val="single" w:color="BFBFBF" w:sz="4"/>
+              <w:right w:val="single" w:color="BFBFBF" w:sz="4"/>
+            </w:tcBorders>
+            <w:tcMar>
+              <w:top w:type="dxa" w:w="50"/>
+              <w:left w:type="dxa" w:w="90"/>
+              <w:bottom w:type="dxa" w:w="50"/>
+              <w:right w:type="dxa" w:w="90"/>
+            </w:tcMar>
+          </w:tcPr>
+          <w:p>
+            <w:r>
+              <w:rPr>
+                <w:b w:val="false"/>
+                <w:bCs w:val="false"/>
+                <w:color w:val="000000"/>
+                <w:sz w:val="17"/>
+                <w:szCs w:val="17"/>
+              </w:rPr>
+              <w:t xml:space="preserve">github.com/CJChANu/Atreides_CodefestDatathon2026</w:t>
+            </w:r>
+          </w:p>
+        </w:tc>
+      </w:tr>
+    </w:tbl>
+    <w:p>
+      <w:pPr>
+        <w:spacing w:after="120"/>
+      </w:pPr>
+      <w:r>
+        <w:t xml:space="preserve">Live: </w:t>
+      </w:r>
+      <w:hyperlink w:history="1" r:id="rIdhx_9_7wtxgoefpgtswfyj">
+        <w:r>
+          <w:rPr>
+            <w:rStyle w:val="Hyperlink"/>
+          </w:rPr>
+          <w:t xml:space="preserve">http://atreides-datathon.duckdns.org</w:t>
+        </w:r>
+      </w:hyperlink>
+      <w:r>
+        <w:t xml:space="preserve">   ·   Source: </w:t>
+      </w:r>
+      <w:hyperlink w:history="1" r:id="rId1y0gn5gg8yw8q4ahjhnyn">
+        <w:r>
+          <w:rPr>
+            <w:rStyle w:val="Hyperlink"/>
+          </w:rPr>
+          <w:t xml:space="preserve">https://github.com/CJChANu/Atreides_CodefestDatathon2026</w:t>
+        </w:r>
+      </w:hyperlink>
+    </w:p>
+    <w:p>
+      <w:pPr>
+        <w:spacing w:after="100" w:line="264"/>
+      </w:pPr>
+      <w:r>
+        <w:rPr>
+          <w:b/>
+          <w:bCs/>
+        </w:rPr>
+        <w:t xml:space="preserve">Engine and cost. </w:t>
+      </w:r>
+      <w:r>
+        <w:t xml:space="preserve">The assistant is provider-agnostic: it uses Claude when an Anthropic key is present, any OpenAI-compatible endpoint when one is configured (it currently runs on a free OpenRouter model), and otherwise its own offline rule-based engine. A model that answers with figures without querying the warehouse is rejected and the offline engine responds instead, so no number reaches the reader without SQL behind it.</w:t>
       </w:r>
     </w:p>
     <w:sectPr>

</xml_diff>